<commit_message>
Rewrite the creativity report around trial overload and unpaid internal help.
The draft uses the former CRA role, the eight-to-ten study load, and the course pack on time pressure and IDEO helping, and it leaves the employer unnamed.

Co-authored-by: jackiechow4567-arch <jackiechow4567-arch@users.noreply.github.com>
</commit_message>
<xml_diff>
--- a/course-work/MGMT5883/consulting-report.docx
+++ b/course-work/MGMT5883/consulting-report.docx
@@ -14,7 +14,7 @@
           <w:i w:val="0"/>
           <w:sz w:val="28"/>
         </w:rPr>
-        <w:t>Employee Creativity and Innovation at PharmaEssentia Hong Kong</w:t>
+        <w:t>Creativity under Trial Overload in a Multinational Clinical Research Organization</w:t>
       </w:r>
     </w:p>
     <w:p>
@@ -29,7 +29,7 @@
           <w:i/>
           <w:sz w:val="22"/>
         </w:rPr>
-        <w:t>A consulting report for the Hong Kong leadership team  |  October 2026</w:t>
+        <w:t>A consulting report  |  October 2026</w:t>
       </w:r>
     </w:p>
     <w:p>
@@ -58,7 +58,7 @@
           <w:i w:val="0"/>
           <w:sz w:val="24"/>
         </w:rPr>
-        <w:t>PharmaEssentia Hong Kong commercializes BESREMi (ropeginterferon alfa-2b) for polycythemia vera and carries the clinical, medical, and compliance work that accompanies that launch. The subsidiary is small, specialist, and governed by the Undesirable Medical Advertisements Ordinance and the HKAPI Code of Practice. In this report, creativity means the generation of new and useful ideas, and innovation means the successful implementation of those ideas. I identify the obstacles that hinder employees from doing this work, then recommend one feasible action for each of the two most critical obstacles, with the steps I would use to put those actions in place. The standard on claims, safety, and conduct stays in place. The change is a path on which useful local ideas can be voiced, tested, and decided.</w:t>
+        <w:t>This report concerns a multinational clinical-research organization where I worked for six and a half years, first as a Clinical Research Associate and later as an Associate Clinical Project Manager. The company runs clinical trials and delivers results to internal functions and to external clients. Creativity here means a novel and useful improvement in how a trial is run. Innovation means that improvement is carried out. I identify the obstacles that kept staff from that kind of creativity, then recommend one feasible action for each of the two most serious obstacles, and the steps I would use to put those actions in place.</w:t>
       </w:r>
     </w:p>
     <w:p>
@@ -87,7 +87,7 @@
           <w:i w:val="0"/>
           <w:sz w:val="24"/>
         </w:rPr>
-        <w:t>Other conditions also hinder creativity: little slack, narrow associate roles, and little joint work between commercial and clinical colleagues. In Amabile's work-environment model these are workload pressure and evaluation pressure. Two obstacles matter more.</w:t>
+        <w:t>Turnover makes both worse. Vacancies are hard to fill, and joiners are mostly new graduates or people seeking faster promotion. Two obstacles do the direct damage.</w:t>
       </w:r>
     </w:p>
     <w:p>
@@ -102,7 +102,7 @@
           <w:i w:val="0"/>
           <w:sz w:val="24"/>
         </w:rPr>
-        <w:t>The first is a split between local ideas and the authority to implement them. Staff can propose useful changes to patient support, formulary evidence, investigator engagement, and handoffs. Claims, price corridors, contracts, and portfolio choices are decided at headquarters, and Hong Kong cannot sign every commitment. A local explanation waits for global lexicon clearance before the team may use it, so the person who sees the gap does not carry the idea into implementation. Creativity and innovation come apart. Administrative innovation follows when leaders design both creation and implementation (Chen, Gong, Song, and Wang, 2021). The decision map is the evidence: Hong Kong owns local tactics; headquarters owns the lexicon, price corridors, and contracts; and no routine turns one local idea into one headquarters decision.</w:t>
+        <w:t>The first is concurrent overload. Associates in peer companies handle about five trials, a figure I take from former colleagues in those firms. Here the same role carried eight to ten at once. Quieter trials still need routine work. When several are active, client requests and dated tasks fill the day. A view of the whole study appears only in a quiet stretch. Hospital documents for a human trial are the clear case: they must be collected and uploaded to the company database, they are less urgent than a client deadline, and they are omitted when the week is full. Leave does not create real cover. Client and hospital mail accumulates. A backup associate can take some urgent items, but study access sits with the responsible associate, so the backup can do only the easy tasks. Amabile (1998) treats time as a resource that must reach a threshold of sufficiency; below it, effort goes into coping. Extreme pressure also cuts creative thinking on that day and the days after (Amabile et al., 2002, as taught in Session 4). The omitted hospital file is the whole-study picture that pressure never allows.</w:t>
       </w:r>
     </w:p>
     <w:p>
@@ -117,7 +117,7 @@
           <w:i w:val="0"/>
           <w:sz w:val="24"/>
         </w:rPr>
-        <w:t>The second obstacle is more critical because it stops ideas earlier. Success means delivery against plan, progress on public access, and a clean promotional and safety record. That is the right floor for a regulated medicine. It hinders creativity when it is the only signal people receive: a novel comment is heard as a compliance risk, and goals reward the number and the code. Learning orientation and psychological safety raise creativity by making information exchange possible (Gong, Kim, Zhu, and Lee, 2013; Gong, Cheung, Wang, and Huang, 2012). Creative self-efficacy and intrinsic motivation for creativity strengthen each other. On difficult work, encouragement and small wins build the belief that a creative result is possible (Chen, Kim, Gong, and Liang, 2025). Feedback here is clearance, lexicon checks, and target reviews, so staff conclude that accurate execution is what the organization values.</w:t>
+        <w:t>The second obstacle is that help has no place in the priority order. The hierarchy gives each person a small piece of the trial. Colleagues rarely step in, because their own list is full and the task often sits outside their access. During internal database audits, associates ask assistants to update the records. Those requests lose to external client work: they are less urgent, and they are not billable. Assistants have no buffer. Management then cannot see the current status of the study. Amabile (1998) includes help through difficulty, and information that actually moves, among the conditions for creativity. IDEO's helping study adds that help fails when the right person is overloaded, so slack has to be designed (Amabile, Fisher, and Pillemer, 2014). If that status fact stays in one queue, managers work from a partial picture (Thompson, chapter 9). Staff also rarely see past their own fragment, and new graduates inherit it.</w:t>
       </w:r>
     </w:p>
     <w:p>
@@ -146,7 +146,7 @@
           <w:i w:val="0"/>
           <w:sz w:val="24"/>
         </w:rPr>
-        <w:t>For the implementation gap, I recommend a quarterly idea-to-decision path. Decision rights stay with headquarters. Once a quarter, the Head of Office chairs a 90-minute session with product, clinical, and compliance in the same room. The technique is to defer judgment, go for quantity, and build on other people's ideas. Each idea is one page: the local problem, why the idea is new, why it is useful for patients or for Hong Kong, and which claims it leaves untouched. Price, new scientific claims, and contract language stay off that page. Compliance attends in order to design a safe test. The group keeps the single strongest idea and scores it on usefulness, compliance containment, and feasibility. The Head of Office then sends headquarters the note this office already uses: two or three options, one recommendation, and a clear split between what Hong Kong can do alone and what needs medical, regulatory, or commercial approval.</w:t>
+        <w:t>For the overload, I recommend an active-trial cap and a backup who can open the study. The pilot uses the current team. Each associate's trials would be marked active or quiet. Active means a client or hospital deadline falls in the current month. Quiet trials still need routine work, and they would no longer compete for the same day as the active set. The active load would be held near the peer reference of about five. Quiet trials would receive a fixed weekly block for the work that is now omitted, beginning with hospital documents and the database upload. That block is the incubation time Amabile (1998) says a pure deadline calendar removes. It is also the moment when pending items become visible, which is the whole-study view associates now get only by accident, in a quiet stretch.</w:t>
       </w:r>
     </w:p>
     <w:p>
@@ -161,7 +161,7 @@
           <w:i w:val="0"/>
           <w:sz w:val="24"/>
         </w:rPr>
-        <w:t>I would apply the course emphasis on disruptive innovation as a boundary (Christensen, Raynor, and McDonald, 2015). The scientific core of BESREMi is a sustaining innovation owned by headquarters, and the processes that protect claims and contracts exist to keep that core consistent across markets. Local experiments belong in the operating system around the product: how evidence is prepared for formulary dialogue, how a field question reaches medical information, and how patient-support steps reduce drop-off. In week one, the Head of Office states that an idea remains an idea until the second stage classifies it. In week two, the pilot uses one problem that commercial and clinical colleagues already share. Within two further weeks, the note goes to headquarters. At day 90, I would apply one test. The idea has received a decision: a local pilot, a request to revise, or a decline that states the reason. A reasoned decline teaches the system. An idea that disappears means the path has failed.</w:t>
+        <w:t>The leave rule changes with the cap. Before approved leave, the named backup receives access to that study, limited to a written list of items that cannot wait. Judgment calls stay with the owner or with the associate clinical project manager. IDEO's helping article is direct: a person who cannot reach the work cannot help (Amabile, Fisher, and Pillemer, 2014). I would pilot this on one team. In the first month I would count active and quiet trials per person. In the second month I would apply the cap and the weekly document block. In the third month I would run one planned leave with access granted in advance. The test is concrete. The document queue is reviewed every week, and a week away does not freeze the study. Where a deadline is genuinely urgent, Session 4's lesson still applies: protect the person from every other interruption and state why that one job is vital, so the day is a mission rather than a treadmill (Amabile et al., 2002).</w:t>
       </w:r>
     </w:p>
     <w:p>
@@ -176,7 +176,7 @@
           <w:i w:val="0"/>
           <w:sz w:val="24"/>
         </w:rPr>
-        <w:t>For the climate, I recommend one covered creative assignment for every associate, each quarter. Performance goals and compliance goals remain, and a learning goal is added beside them. Intrinsic interest and extrinsic goals produce more creativity when they are tuned together, so the assignment is real work and the attempt is recognized (Gong, Wu, Song, and Zhang, 2017). A commercial colleague might redraw the path a field question takes into medical information. A clinical colleague might propose two cleaner handoffs between site follow-up and medical information. The manager tells the person that they are capable of the work, defines the finished product as a one-page set of options, and comments on novelty and usefulness. The task sits slightly outside the person's usual lane. That variety engages them in the creative process and rebuilds creative self-efficacy on difficult work (Chen, Kim, Gong, and Liang, 2025). The first review uses the same rules as the quarterly session, so comments address the idea in the convergent pass. One line is added to the biweekly review the office already holds: what we learned, and what we will try next.</w:t>
+        <w:t>For the helping failure, I recommend making the status update a defined task with a short protected slot. Each study would have a weekly update owned by a named assistant. The slot is small, and it is not cancelled by default when an external email arrives. A real client deadline keeps its place. The internal update is no longer priced at zero because it cannot be billed. The associate clinical project manager reads one line: the date of the last complete update. A slipped date is visible before an audit, which is the gap management now discovers late. This follows the IDEO design of a role, a process, and slack (Amabile, Fisher, and Pillemer, 2014). I would not add a prize for being helpful. The article expects that contest to produce competitive helping. Amabile (1998) asks for information that moves and for help through difficulty. A named slot is the smallest system that does both.</w:t>
       </w:r>
     </w:p>
     <w:p>
@@ -191,7 +191,7 @@
           <w:i w:val="0"/>
           <w:sz w:val="24"/>
         </w:rPr>
-        <w:t>I would implement this with the resources the office already has. Headcount stays as it is, and compliance remains above commercial convenience. The lever is managerial behavior on hard work: encouragement, a bounded challenge, and a small win. By the end of the quarter, each associate has completed one small win, and the Head of Office can point to one process that changed because of an employee's idea. A five-question pulse at that point, covering voice, learning, safety, time, and whether an idea received a decision, tells leadership whether the climate moved.</w:t>
+        <w:t>The same pilot widens the narrow job that new staff inherit. A new graduate would be matched to a smaller active load. That is Amabile's challenge rule: enough stretch to learn, and short of a load in which the person can only react (Amabile, 1998). In the first months they would follow one document from the hospital, through the database, to the status line, so the fragment is tied to the whole study. Thompson's point on unique information is the reason: the status fact has to leave the assistant's queue and reach the manager. I would run this with the people already on the team. Headcount and the company's reputation in the labor market will not turn in one quarter. The high turnover is a reason to make the load one a new joiner can learn.</w:t>
       </w:r>
     </w:p>
     <w:p>
@@ -220,7 +220,7 @@
           <w:i w:val="0"/>
           <w:sz w:val="24"/>
         </w:rPr>
-        <w:t>PharmaEssentia Hong Kong has a serious task and capable people. The subsidiary needs a path from a new and useful idea to a decision, and a climate in which employees can develop an idea and then have that idea judged. The two actions are small on purpose. A quarterly idea-to-decision path makes innovation mean implementation. One covered assignment per person makes creative work part of the job. Claims, safety, and conduct remain the floor. Headquarters receives an option and a recommendation. The people closest to patients in Hong Kong gain a way to improve the system around a medicine that already has a global standard.</w:t>
+        <w:t>Creativity in this organization is a useful improvement in how a trial is run: a complete document set, a status a manager can trust, and a colleague who can cover a week of leave. The two obstacles are an active load well above the peer reference, and a priority order in which non-billable help never gets a turn. High turnover keeps both in place by refilling the roles with people who have not yet seen a whole study. The two actions are an active-trial cap with real backup access, and a scheduled status update that belongs to a named person. Staff can then see the whole trial and still meet the deadlines that matter.</w:t>
       </w:r>
     </w:p>
     <w:sectPr>
@@ -284,7 +284,7 @@
         <w:color w:val="555555"/>
         <w:sz w:val="18"/>
       </w:rPr>
-      <w:t>PharmaEssentia Hong Kong  |  Consulting report</w:t>
+      <w:t>Clinical research organization  |  Consulting report</w:t>
     </w:r>
   </w:p>
 </w:hdr>

</xml_diff>

<commit_message>
Staff the trial cap with headcount, pay, dual access, interns, and AI.
The recommendations now request the people and salary needed to hold about five active trials, put two associates on every study, and move routine administration to interns and AI.

Co-authored-by: jackiechow4567-arch <jackiechow4567-arch@users.noreply.github.com>
</commit_message>
<xml_diff>
--- a/course-work/MGMT5883/consulting-report.docx
+++ b/course-work/MGMT5883/consulting-report.docx
@@ -146,7 +146,7 @@
           <w:i w:val="0"/>
           <w:sz w:val="24"/>
         </w:rPr>
-        <w:t>For the overload, I recommend an active-trial cap and a backup who can open the study. The pilot uses the current team. Each associate's trials would be marked active or quiet. Active means a client or hospital deadline falls in the current month. Quiet trials still need routine work, and they would no longer compete for the same day as the active set. The active load would be held near the peer reference of about five. Quiet trials would receive a fixed weekly block for the work that is now omitted, beginning with hospital documents and the database upload. That block is the incubation time Amabile (1998) says a pure deadline calendar removes. It is also the moment when pending items become visible, which is the whole-study view associates now get only by accident, in a quiet stretch.</w:t>
+        <w:t>For the overload, I recommend a staffed cap of about five active trials per associate. The cap needs people. I would ask the team for the missing headcount: count the active trials, divide by five, and subtract the associates already in the role. Pay has to rise with those seats. The present load is known in the industry, and the people who accept it are mostly new graduates or candidates seeking a fast promotion. A higher salary is how associates who have already run a whole trial will take the job. That is Amabile's expertise component. It is the resource that lets the load reach a threshold of sufficiency. Pay above a fair load does not buy creativity. Pay that brings the load to about five, and brings people who can see a whole study, is the money the 1998 article says is missing (Amabile, 1998).</w:t>
       </w:r>
     </w:p>
     <w:p>
@@ -161,7 +161,7 @@
           <w:i w:val="0"/>
           <w:sz w:val="24"/>
         </w:rPr>
-        <w:t>The leave rule changes with the cap. Before approved leave, the named backup receives access to that study, limited to a written list of items that cannot wait. Judgment calls stay with the owner or with the associate clinical project manager. IDEO's helping article is direct: a person who cannot reach the work cannot help (Amabile, Fisher, and Pillemer, 2014). I would pilot this on one team. In the first month I would count active and quiet trials per person. In the second month I would apply the cap and the weekly document block. In the third month I would run one planned leave with access granted in advance. The test is concrete. The document queue is reviewed every week, and a week away does not freeze the study. Where a deadline is genuinely urgent, Session 4's lesson still applies: protect the person from every other interruption and state why that one job is vital, so the day is a mission rather than a treadmill (Amabile et al., 2002).</w:t>
+        <w:t>Every study would have at least two associates with access. The second person's authority is limited to a written list of items that cannot wait, so cover is standing and a week of leave does not freeze the study. IDEO's helping article is direct: a person who cannot reach the work cannot help (Amabile, Fisher, and Pillemer, 2014). I would make one request. In the first month I would count active trials and write the headcount and pay case. In the second month I would hire against that number and pair every study. In the third month, once the active load is near five, the quieter trials would get a weekly block for the hospital documents that are now omitted. The test is the load itself. Active trials sit near five per person, and the document queue is reviewed every week. Where one deadline is genuinely urgent, Session 4 still applies: protect that person from every other interruption and state why the job is vital (Amabile et al., 2002).</w:t>
       </w:r>
     </w:p>
     <w:p>
@@ -176,7 +176,7 @@
           <w:i w:val="0"/>
           <w:sz w:val="24"/>
         </w:rPr>
-        <w:t>For the helping failure, I recommend making the status update a defined task with a short protected slot. Each study would have a weekly update owned by a named assistant. The slot is small, and it is not cancelled by default when an external email arrives. A real client deadline keeps its place. The internal update is no longer priced at zero because it cannot be billed. The associate clinical project manager reads one line: the date of the last complete update. A slipped date is visible before an audit, which is the gap management now discovers late. This follows the IDEO design of a role, a process, and slack (Amabile, Fisher, and Pillemer, 2014). I would not add a prize for being helpful. The article expects that contest to produce competitive helping. Amabile (1998) asks for information that moves and for help through difficulty. A named slot is the smallest system that does both.</w:t>
+        <w:t>For the failure of help, I recommend taking routine administration off the associates, so they have slack for work that is not on a client deadline. University interns would do defined administration: collecting and filing hospital documents, and preparing the papers in a payment to a hospital. An AI system would draft routine reports, categorize documents, and prepare the hospital payment steps. Associates keep the judgment: whether the file is complete, whether the report is accurate, and whether the payment is right. Session 4 teaches that a model can raise the output of a piece of work and can also make the drafts more alike, while the decision that something is useful stays with the person who knows the study (Doshi and Hauser, 2024, as taught). That freed time is the slack IDEO says helping requires (Amabile, Fisher, and Pillemer, 2014). The database update can then sit in the week, owned by a named person, because the hour is no longer lost to filing.</w:t>
       </w:r>
     </w:p>
     <w:p>
@@ -191,7 +191,7 @@
           <w:i w:val="0"/>
           <w:sz w:val="24"/>
         </w:rPr>
-        <w:t>The same pilot widens the narrow job that new staff inherit. A new graduate would be matched to a smaller active load. That is Amabile's challenge rule: enough stretch to learn, and short of a load in which the person can only react (Amabile, 1998). In the first months they would follow one document from the hospital, through the database, to the status line, so the fragment is tied to the whole study. Thompson's point on unique information is the reason: the status fact has to leave the assistant's queue and reach the manager. I would run this with the people already on the team. Headcount and the company's reputation in the labor market will not turn in one quarter. The high turnover is a reason to make the load one a new joiner can learn.</w:t>
+        <w:t>The intern's list would be written, and it would stop short of client decisions. Amabile's challenge rule is to match the task to the person: an intern learns the administration, and the associate is no longer the only one who can touch a document (Amabile, 1998). The AI tools would start on three streams only: report drafts, document categories, and hospital payments. The associate clinical project manager would still read the date of the last database update, so a stale status is visible before an audit. Thompson's chapter is why that line exists: the fact has to leave one person's queue. Interns and the tools can start in the same quarter as the headcount request. They ease the present team while the new associates are being found.</w:t>
       </w:r>
     </w:p>
     <w:p>
@@ -220,7 +220,7 @@
           <w:i w:val="0"/>
           <w:sz w:val="24"/>
         </w:rPr>
-        <w:t>Creativity in this organization is a useful improvement in how a trial is run: a complete document set, a status a manager can trust, and a colleague who can cover a week of leave. The two obstacles are an active load well above the peer reference, and a priority order in which non-billable help never gets a turn. High turnover keeps both in place by refilling the roles with people who have not yet seen a whole study. The two actions are an active-trial cap with real backup access, and a scheduled status update that belongs to a named person. Staff can then see the whole trial and still meet the deadlines that matter.</w:t>
+        <w:t>Creativity in this organization is a useful improvement in how a trial is run: a complete document set, a status a manager can trust, and a second associate who can cover the items that cannot wait. The two actions are a staffed cap near five, with pay that can attract experienced people and two-person access on every study, and a shift of routine administration to interns and to AI so that regular staff have time to see the whole trial. Headcount, pay, access, interns, and tools are one design. Each piece fails if the others are left out.</w:t>
       </w:r>
     </w:p>
     <w:sectPr>

</xml_diff>

<commit_message>
Limit interns to internal documentation and keep payments with associates.
Interns support document work and internal updates that do not face clients, and they learn the trial through that work. Payment stays with the associates.

Co-authored-by: jackiechow4567-arch <jackiechow4567-arch@users.noreply.github.com>
</commit_message>
<xml_diff>
--- a/course-work/MGMT5883/consulting-report.docx
+++ b/course-work/MGMT5883/consulting-report.docx
@@ -176,7 +176,7 @@
           <w:i w:val="0"/>
           <w:sz w:val="24"/>
         </w:rPr>
-        <w:t>For the failure of help, I recommend taking routine administration off the associates, so they have slack for work that is not on a client deadline. University interns would do defined administration: collecting and filing hospital documents, and preparing the papers in a payment to a hospital. An AI system would draft routine reports, categorize documents, and prepare the hospital payment steps. Associates keep the judgment: whether the file is complete, whether the report is accurate, and whether the payment is right. Session 4 teaches that a model can raise the output of a piece of work and can also make the drafts more alike, while the decision that something is useful stays with the person who knows the study (Doshi and Hauser, 2024, as taught). That freed time is the slack IDEO says helping requires (Amabile, Fisher, and Pillemer, 2014). The database update can then sit in the week, owned by a named person, because the hour is no longer lost to filing.</w:t>
+        <w:t>For the failure of help, I recommend moving internal work, and the documentation that supports it, to university interns. That work faces the company, not the client. Interns would support the associate on documentation: collecting hospital files, checking that a set is complete against a list, and uploading it. They would also keep the internal database current for audits. They would not handle payments. Through the documents and the status updates they would learn how a trial actually runs, which is the industry knowledge a narrow job never shows them. An AI system would still draft routine reports, categorize documents, and prepare hospital payment steps. Associates keep the judgment, including whether a payment is right. Session 4 teaches that a model can raise output and can also make drafts more alike, while usefulness stays with the person who knows the study (Doshi and Hauser, 2024, as taught). The hour freed is the slack IDEO says helping requires (Amabile, Fisher, and Pillemer, 2014).</w:t>
       </w:r>
     </w:p>
     <w:p>
@@ -191,7 +191,7 @@
           <w:i w:val="0"/>
           <w:sz w:val="24"/>
         </w:rPr>
-        <w:t>The intern's list would be written, and it would stop short of client decisions. Amabile's challenge rule is to match the task to the person: an intern learns the administration, and the associate is no longer the only one who can touch a document (Amabile, 1998). The AI tools would start on three streams only: report drafts, document categories, and hospital payments. The associate clinical project manager would still read the date of the last database update, so a stale status is visible before an audit. Thompson's chapter is why that line exists: the fact has to leave one person's queue. Interns and the tools can start in the same quarter as the headcount request. They ease the present team while the new associates are being found.</w:t>
+        <w:t>The intern's list would be written: documentation support and internal updates, and no payments. Amabile's challenge rule is to match the task to the person. An intern can learn the trial from the files without carrying client risk, and the associate is no longer the only one who can complete a document set (Amabile, 1998). The AI tools would start on three streams: report drafts, document categories, and payment preparation for an associate to approve. The associate clinical project manager would still read the date of the last database update. Thompson's chapter is why that line exists: the fact has to leave one person's queue. Interns and the tools can start in the same quarter as the headcount request. They ease the present team while the new associates are being found.</w:t>
       </w:r>
     </w:p>
     <w:p>

</xml_diff>

<commit_message>
Name IQVIA RDS Limited and the parent's market capitalization in the introduction.
The listed parent, IQVIA Holdings, trades as IQV and was worth about $44 billion in mid-October 2026.

Co-authored-by: jackiechow4567-arch <jackiechow4567-arch@users.noreply.github.com>
</commit_message>
<xml_diff>
--- a/course-work/MGMT5883/consulting-report.docx
+++ b/course-work/MGMT5883/consulting-report.docx
@@ -14,7 +14,7 @@
           <w:i w:val="0"/>
           <w:sz w:val="28"/>
         </w:rPr>
-        <w:t>Creativity under Trial Overload in a Multinational Clinical Research Organization</w:t>
+        <w:t>Creativity under Trial Overload at IQVIA RDS Limited</w:t>
       </w:r>
     </w:p>
     <w:p>
@@ -58,7 +58,7 @@
           <w:i w:val="0"/>
           <w:sz w:val="24"/>
         </w:rPr>
-        <w:t>This report concerns a multinational clinical-research organization where I worked for six and a half years, first as a Clinical Research Associate and later as an Associate Clinical Project Manager. The company runs clinical trials and delivers results to internal functions and to external clients. Creativity here means a novel and useful improvement in how a trial is run. Innovation means that improvement is carried out. I identify the obstacles that kept staff from that kind of creativity, then recommend one feasible action for each of the two most serious obstacles, and the steps I would use to put those actions in place.</w:t>
+        <w:t>This report concerns IQVIA RDS Limited, part of IQVIA Holdings Inc., an international contract research organization listed in the United States under the ticker IQV. The listed parent had a market capitalization of about $44 billion in mid-October 2026. I worked there for six and a half years, first as a Clinical Research Associate and later as an Associate Clinical Project Manager. The company runs clinical trials and delivers results to internal functions and to external clients. Creativity here means a novel and useful improvement in how a trial is run. Innovation means that improvement is carried out. I identify the obstacles that kept staff from that kind of creativity, then recommend one feasible action for each of the two most serious obstacles, and the steps I would use to put those actions in place.</w:t>
       </w:r>
     </w:p>
     <w:p>
@@ -284,7 +284,7 @@
         <w:color w:val="555555"/>
         <w:sz w:val="18"/>
       </w:rPr>
-      <w:t>Clinical research organization  |  Consulting report</w:t>
+      <w:t>IQVIA RDS Limited  |  Consulting report</w:t>
     </w:r>
   </w:p>
 </w:hdr>

</xml_diff>

<commit_message>
Rewrite the IQVIA report in a direct first-person style.
The draft keeps the same facts and course citations, and it uses shorter sentences closer to the author's own notes.

Co-authored-by: jackiechow4567-arch <jackiechow4567-arch@users.noreply.github.com>
</commit_message>
<xml_diff>
--- a/course-work/MGMT5883/consulting-report.docx
+++ b/course-work/MGMT5883/consulting-report.docx
@@ -58,7 +58,7 @@
           <w:i w:val="0"/>
           <w:sz w:val="24"/>
         </w:rPr>
-        <w:t>This report concerns IQVIA RDS Limited, part of IQVIA Holdings Inc., an international contract research organization listed in the United States under the ticker IQV. The listed parent had a market capitalization of about $44 billion in mid-October 2026. I worked there for six and a half years, first as a Clinical Research Associate and later as an Associate Clinical Project Manager. The company runs clinical trials and delivers results to internal functions and to external clients. Creativity here means a novel and useful improvement in how a trial is run. Innovation means that improvement is carried out. I identify the obstacles that kept staff from that kind of creativity, then recommend one feasible action for each of the two most serious obstacles, and the steps I would use to put those actions in place.</w:t>
+        <w:t>This report is about IQVIA RDS Limited. It is part of IQVIA Holdings Inc., an international contract research organisation listed in the United States (ticker: IQV). In mid-October 2026, the listed parent had a market capitalisation of about $44 billion. I worked in this company for 6.5 years. I started as a Clinical Research Associate, and my last title was Associate Clinical Project Manager. My projects were clinical trials, and we delivered the results to both internal parties and external clients. In this course, creativity means a new and useful idea, and innovation means the idea is carried out. Below I explain two obstacles that hindered creativity in this organisation, and I give one recommendation for each, including how I would implement it.</w:t>
       </w:r>
     </w:p>
     <w:p>
@@ -87,7 +87,7 @@
           <w:i w:val="0"/>
           <w:sz w:val="24"/>
         </w:rPr>
-        <w:t>Turnover makes both worse. Vacancies are hard to fill, and joiners are mostly new graduates or people seeking faster promotion. Two obstacles do the direct damage.</w:t>
+        <w:t>The workload is well known in the industry, so a resignation is hard to replace. Usually only fresh graduates, or people who want a faster promotion, will join. Hence turnover is high, and both obstacles below get worse.</w:t>
       </w:r>
     </w:p>
     <w:p>
@@ -102,7 +102,7 @@
           <w:i w:val="0"/>
           <w:sz w:val="24"/>
         </w:rPr>
-        <w:t>The first is concurrent overload. Associates in peer companies handle about five trials, a figure I take from former colleagues in those firms. Here the same role carried eight to ten at once. Quieter trials still need routine work. When several are active, client requests and dated tasks fill the day. A view of the whole study appears only in a quiet stretch. Hospital documents for a human trial are the clear case: they must be collected and uploaded to the company database, they are less urgent than a client deadline, and they are omitted when the week is full. Leave does not create real cover. Client and hospital mail accumulates. A backup associate can take some urgent items, but study access sits with the responsible associate, so the backup can do only the easy tasks. Amabile (1998) treats time as a resource that must reach a threshold of sufficiency; below it, effort goes into coping. Extreme pressure also cuts creative thinking on that day and the days after (Amabile et al., 2002, as taught in Session 4). The omitted hospital file is the whole-study picture that pressure never allows.</w:t>
+        <w:t>The first obstacle is overload. I handled 8 to 10 studies at the same time. Ex-colleagues told me that about 5 studies is the usual load in other companies in this industry. The quieter studies still had routine work. When several were active, client requests and deadlines filled the day. It was hard to manage the rest, and I had no time to look at the whole picture. For example, a human trial needs many documents. We collect them from the hospitals and upload them to the company database. These tasks are less urgent, so they are easily omitted. Leave was also hard. Client and hospital emails piled up. A backup CRA could take some urgent tasks, but study access is limited to the responsible CRA, so the backup could only do easy tasks. Amabile (1998) says that if time is not sufficient, people only cope with deadlines. Session 4 taught that very high time pressure made people 45% less likely to think creatively, and the effect continued into the next days (Amabile et al., 2002). The document work, which shows the whole study, was the first thing dropped.</w:t>
       </w:r>
     </w:p>
     <w:p>
@@ -117,7 +117,7 @@
           <w:i w:val="0"/>
           <w:sz w:val="24"/>
         </w:rPr>
-        <w:t>The second obstacle is that help has no place in the priority order. The hierarchy gives each person a small piece of the trial. Colleagues rarely step in, because their own list is full and the task often sits outside their access. During internal database audits, associates ask assistants to update the records. Those requests lose to external client work: they are less urgent, and they are not billable. Assistants have no buffer. Management then cannot see the current status of the study. Amabile (1998) includes help through difficulty, and information that actually moves, among the conditions for creativity. IDEO's helping study adds that help fails when the right person is overloaded, so slack has to be designed (Amabile, Fisher, and Pillemer, 2014). If that status fact stays in one queue, managers work from a partial picture (Thompson, chapter 9). Staff also rarely see past their own fragment, and new graduates inherit it.</w:t>
+        <w:t>The second obstacle is that people cannot help each other. The hierarchy is clear, and each person only manages his or her own tasks. When a colleague is in trouble, others are already too busy, and they may not have access to that study. Hence exposure stays inside one's own position. For internal audits, we asked clinical research assistants to update the database. An internal request is less urgent than a client request, and assistants have no buffer time. Besides, this work is usually not billable, so the priority is lower. If the system is not updated, higher management cannot see the latest status. Amabile (1998) says creativity needs help through a difficulty, and it needs information to move. The IDEO article adds that help fails when people are already full, so spare time has to be planned (Amabile, Fisher, and Pillemer, 2014). Thompson's chapter says the same thing about facts: if one person keeps the update, the others work with an incomplete picture.</w:t>
       </w:r>
     </w:p>
     <w:p>
@@ -146,7 +146,7 @@
           <w:i w:val="0"/>
           <w:sz w:val="24"/>
         </w:rPr>
-        <w:t>For the overload, I recommend a staffed cap of about five active trials per associate. The cap needs people. I would ask the team for the missing headcount: count the active trials, divide by five, and subtract the associates already in the role. Pay has to rise with those seats. The present load is known in the industry, and the people who accept it are mostly new graduates or candidates seeking a fast promotion. A higher salary is how associates who have already run a whole trial will take the job. That is Amabile's expertise component. It is the resource that lets the load reach a threshold of sufficiency. Pay above a fair load does not buy creativity. Pay that brings the load to about five, and brings people who can see a whole study, is the money the 1998 article says is missing (Amabile, 1998).</w:t>
+        <w:t>For the overload, I recommend capping active trials at about five per associate. To do this, headcount should be requested. More manpower is required to handle the study work. I would count the active trials, divide by five, and subtract the current number of associates. That gap is the headcount to request. Salary should also be increased, so the company can attract talents who have already run a study, not only fresh graduates. Amabile (1998) treats expertise as one part of creativity, and she treats time as a resource that has to be sufficient. If the load stays at 8 to 10, a higher salary alone still leaves no time to look at the whole picture. The salary is to bring in capable people. The headcount is to bring the load down to about five.</w:t>
       </w:r>
     </w:p>
     <w:p>
@@ -161,7 +161,7 @@
           <w:i w:val="0"/>
           <w:sz w:val="24"/>
         </w:rPr>
-        <w:t>Every study would have at least two associates with access. The second person's authority is limited to a written list of items that cannot wait, so cover is standing and a week of leave does not freeze the study. IDEO's helping article is direct: a person who cannot reach the work cannot help (Amabile, Fisher, and Pillemer, 2014). I would make one request. In the first month I would count active trials and write the headcount and pay case. In the second month I would hire against that number and pair every study. In the third month, once the active load is near five, the quieter trials would get a weekly block for the hospital documents that are now omitted. The test is the load itself. Active trials sit near five per person, and the document queue is reviewed every week. Where one deadline is genuinely urgent, Session 4 still applies: protect that person from every other interruption and state why the job is vital (Amabile et al., 2002).</w:t>
+        <w:t>Besides, each study should have at least two associates with access. The second associate should be limited to a written list of items that cannot wait. Then, when the responsible associate takes leave, the backup is not stuck with easy tasks only, and the study does not stop. This follows the IDEO point that a person who cannot reach the work cannot help (Amabile, Fisher, and Pillemer, 2014). I would do it in three steps. In the first month, I would count the active trials and prepare the headcount and salary request. In the second month, I would hire and put two associates on each study. In the third month, after the active load is near five, I would set a weekly time block for the quieter studies, so the hospital documents that are now omitted can be followed up. I would check two results: each person has about five active trials, and the document list is reviewed every week. If one deadline is truly urgent, Session 4 suggests protecting that person from other interruptions and stating why the job is important (Amabile et al., 2002).</w:t>
       </w:r>
     </w:p>
     <w:p>
@@ -176,7 +176,7 @@
           <w:i w:val="0"/>
           <w:sz w:val="24"/>
         </w:rPr>
-        <w:t>For the failure of help, I recommend moving internal work, and the documentation that supports it, to university interns. That work faces the company, not the client. Interns would support the associate on documentation: collecting hospital files, checking that a set is complete against a list, and uploading it. They would also keep the internal database current for audits. They would not handle payments. Through the documents and the status updates they would learn how a trial actually runs, which is the industry knowledge a narrow job never shows them. An AI system would still draft routine reports, categorize documents, and prepare hospital payment steps. Associates keep the judgment, including whether a payment is right. Session 4 teaches that a model can raise output and can also make drafts more alike, while usefulness stays with the person who knows the study (Doshi and Hauser, 2024, as taught). The hour freed is the slack IDEO says helping requires (Amabile, Fisher, and Pillemer, 2014).</w:t>
+        <w:t>For the second problem, I recommend hiring university interns for the internal work. This work faces the company, not the client, so it does not directly affect the client. Interns can support the associate on documentation, for example collecting hospital files, checking them against the list, and uploading them. They can also update the internal database for audits. Payment will not be handled by them. Through this process, interns can learn more about the industry, and regular staff can have more time. AI can support the regular work as well, for example report writing, document categorisation, and preparing the payment process to hospitals. The associate still checks whether the report is correct and whether the payment is right. Session 4 taught that AI can increase output, but the drafts can also become more similar, so the judgment should stay with the person who knows the study (Doshi and Hauser, 2024). The time saved is the spare time that the IDEO article says a helping culture needs (Amabile, Fisher, and Pillemer, 2014).</w:t>
       </w:r>
     </w:p>
     <w:p>
@@ -191,7 +191,7 @@
           <w:i w:val="0"/>
           <w:sz w:val="24"/>
         </w:rPr>
-        <w:t>The intern's list would be written: documentation support and internal updates, and no payments. Amabile's challenge rule is to match the task to the person. An intern can learn the trial from the files without carrying client risk, and the associate is no longer the only one who can complete a document set (Amabile, 1998). The AI tools would start on three streams: report drafts, document categories, and payment preparation for an associate to approve. The associate clinical project manager would still read the date of the last database update. Thompson's chapter is why that line exists: the fact has to leave one person's queue. Interns and the tools can start in the same quarter as the headcount request. They ease the present team while the new associates are being found.</w:t>
+        <w:t>I would write the intern's job list clearly: documentation support and internal updates, and no payment. This matches Amabile's point that the task should fit the person (Amabile, 1998). An intern can learn from the files without taking client risk, and the associate is no longer the only person who can complete the document set. AI would start with three types of work: report drafts, document categories, and payment preparation for an associate to approve. I would still check the date of the last database update, so a gap is seen before the audit. Thompson's chapter explains why this check matters: the updated status has to leave one person's queue and reach the manager. Interns and the AI tools can start in the same quarter as the headcount request. They can ease the current team while the new associates are being hired.</w:t>
       </w:r>
     </w:p>
     <w:p>
@@ -220,7 +220,7 @@
           <w:i w:val="0"/>
           <w:sz w:val="24"/>
         </w:rPr>
-        <w:t>Creativity in this organization is a useful improvement in how a trial is run: a complete document set, a status a manager can trust, and a second associate who can cover the items that cannot wait. The two actions are a staffed cap near five, with pay that can attract experienced people and two-person access on every study, and a shift of internal documentation to interns and of routine drafting to AI, so that regular staff have time to see the whole trial. Payments stay with the associates. Headcount, pay, access, interns, and tools are one design. Each piece fails if the others are left out.</w:t>
+        <w:t>In this organisation, a creative idea is a useful improvement in how a trial is run. Examples are a complete document set, a status that management can trust, and a second associate who can cover the items that cannot wait. I recommend two actions. First, request headcount and a higher salary so that each associate handles about five active trials, and assign two associates with access to each study. Second, let university interns support documentation and internal updates, and use AI for routine reports, document categorisation, and payment preparation. Payment decisions stay with the associates. The two actions need each other. Headcount alone still leaves the internal work undone.</w:t>
       </w:r>
     </w:p>
     <w:sectPr>

</xml_diff>